<commit_message>
Add HCI improvements, login transition loader, and doc corrections
- Admin UX: day-modal filter hint, export-and-clear preview,
  overpaid badge, partial-refund note, flush jargon tooltips
- Integration page: per-service health (last OK/error) + on-demand
  "Check now" probe for Gemini/Groq, audit-logged
- Login: branded "Signing you in…" loader handing off to the
  landing page on both password and Google sign-in
- Guest: resume-stay chip on homepage from wizard draft
- Docs: regenerate schema from live DB, add UseCase-Corrections
  and HCI-Analysis; add rationale comments to core services
</commit_message>
<xml_diff>
--- a/docs/HotelDb-Schema.docx
+++ b/docs/HotelDb-Schema.docx
@@ -862,7 +862,7 @@
                 <w:color w:val="222222"/>
                 <w:sz w:val="16"/>
               </w:rPr>
-              <w:t>One verified post-checkout review per booking — unique index on BookingId enforces the cap.</w:t>
+              <w:t>One verified post-checkout review per booking — unique index on BookingId enforces the cap. Staff can hide (IsPublished) or soft-delete (DeletedAtUtc/By/Reason/Note) without losing the row.</w:t>
             </w:r>
           </w:p>
         </w:tc>
@@ -5725,7 +5725,7 @@
                 <w:color w:val="222222"/>
                 <w:sz w:val="16"/>
               </w:rPr>
-              <w:t>Owning stay</w:t>
+              <w:t>Owning stay — unique (BookingId,RoomTypeId): one line per type</w:t>
             </w:r>
           </w:p>
         </w:tc>
@@ -6256,6 +6256,7 @@
                 <w:color w:val="222222"/>
                 <w:sz w:val="16"/>
               </w:rPr>
+              <w:t>Unique (BookingItemId,RoomId) — a room can appear only once per line</w:t>
             </w:r>
           </w:p>
         </w:tc>
@@ -7229,6 +7230,7 @@
                 <w:color w:val="222222"/>
                 <w:sz w:val="16"/>
               </w:rPr>
+              <w:t>unique idx</w:t>
             </w:r>
           </w:p>
         </w:tc>
@@ -9377,6 +9379,7 @@
                 <w:color w:val="222222"/>
                 <w:sz w:val="16"/>
               </w:rPr>
+              <w:t>required / NULL</w:t>
             </w:r>
           </w:p>
         </w:tc>
@@ -10047,7 +10050,7 @@
           <w:color w:val="0B1F3A"/>
           <w:sz w:val="18"/>
         </w:rPr>
-        <w:t>One verified post-checkout review per booking — unique index on BookingId enforces the cap.</w:t>
+        <w:t>One verified post-checkout review per booking — unique index on BookingId enforces the cap. Staff can hide (IsPublished) or soft-delete (DeletedAtUtc/By/Reason/Note) without losing the row.</w:t>
       </w:r>
     </w:p>
     <w:tbl>
@@ -10827,6 +10830,146 @@
                 <w:sz w:val="16"/>
               </w:rPr>
               <w:t>Derived flag for fast reply filtering</w:t>
+            </w:r>
+          </w:p>
+        </w:tc>
+      </w:tr>
+      <w:tr>
+        <w:tc>
+          <w:tcPr>
+            <w:tcW w:type="dxa" w:w="2160"/>
+          </w:tcPr>
+          <w:p>
+            <w:r/>
+            <w:r>
+              <w:rPr>
+                <w:rFonts w:ascii="Calibri" w:hAnsi="Calibri" w:eastAsia="Calibri"/>
+                <w:b w:val="0"/>
+                <w:color w:val="222222"/>
+                <w:sz w:val="16"/>
+              </w:rPr>
+              <w:t>DeletedAtUtc / DeletedBy</w:t>
+            </w:r>
+          </w:p>
+        </w:tc>
+        <w:tc>
+          <w:tcPr>
+            <w:tcW w:type="dxa" w:w="2160"/>
+          </w:tcPr>
+          <w:p>
+            <w:r/>
+            <w:r>
+              <w:rPr>
+                <w:rFonts w:ascii="Calibri" w:hAnsi="Calibri" w:eastAsia="Calibri"/>
+                <w:b w:val="0"/>
+                <w:color w:val="222222"/>
+                <w:sz w:val="16"/>
+              </w:rPr>
+              <w:t>datetime2 / nvarchar(120)</w:t>
+            </w:r>
+          </w:p>
+        </w:tc>
+        <w:tc>
+          <w:tcPr>
+            <w:tcW w:type="dxa" w:w="2160"/>
+          </w:tcPr>
+          <w:p>
+            <w:r/>
+            <w:r>
+              <w:rPr>
+                <w:rFonts w:ascii="Calibri" w:hAnsi="Calibri" w:eastAsia="Calibri"/>
+                <w:b w:val="0"/>
+                <w:color w:val="222222"/>
+                <w:sz w:val="16"/>
+              </w:rPr>
+              <w:t>NULL</w:t>
+            </w:r>
+          </w:p>
+        </w:tc>
+        <w:tc>
+          <w:tcPr>
+            <w:tcW w:type="dxa" w:w="2160"/>
+          </w:tcPr>
+          <w:p>
+            <w:r/>
+            <w:r>
+              <w:rPr>
+                <w:rFonts w:ascii="Calibri" w:hAnsi="Calibri" w:eastAsia="Calibri"/>
+                <w:b w:val="0"/>
+                <w:color w:val="222222"/>
+                <w:sz w:val="16"/>
+              </w:rPr>
+              <w:t>Soft-delete stamp — row kept, hidden from public</w:t>
+            </w:r>
+          </w:p>
+        </w:tc>
+      </w:tr>
+      <w:tr>
+        <w:tc>
+          <w:tcPr>
+            <w:tcW w:type="dxa" w:w="2160"/>
+          </w:tcPr>
+          <w:p>
+            <w:r/>
+            <w:r>
+              <w:rPr>
+                <w:rFonts w:ascii="Calibri" w:hAnsi="Calibri" w:eastAsia="Calibri"/>
+                <w:b w:val="0"/>
+                <w:color w:val="222222"/>
+                <w:sz w:val="16"/>
+              </w:rPr>
+              <w:t>DeletedReason / DeletedNote</w:t>
+            </w:r>
+          </w:p>
+        </w:tc>
+        <w:tc>
+          <w:tcPr>
+            <w:tcW w:type="dxa" w:w="2160"/>
+          </w:tcPr>
+          <w:p>
+            <w:r/>
+            <w:r>
+              <w:rPr>
+                <w:rFonts w:ascii="Calibri" w:hAnsi="Calibri" w:eastAsia="Calibri"/>
+                <w:b w:val="0"/>
+                <w:color w:val="222222"/>
+                <w:sz w:val="16"/>
+              </w:rPr>
+              <w:t>nvarchar(200) / nvarchar(500)</w:t>
+            </w:r>
+          </w:p>
+        </w:tc>
+        <w:tc>
+          <w:tcPr>
+            <w:tcW w:type="dxa" w:w="2160"/>
+          </w:tcPr>
+          <w:p>
+            <w:r/>
+            <w:r>
+              <w:rPr>
+                <w:rFonts w:ascii="Calibri" w:hAnsi="Calibri" w:eastAsia="Calibri"/>
+                <w:b w:val="0"/>
+                <w:color w:val="222222"/>
+                <w:sz w:val="16"/>
+              </w:rPr>
+              <w:t>NULL</w:t>
+            </w:r>
+          </w:p>
+        </w:tc>
+        <w:tc>
+          <w:tcPr>
+            <w:tcW w:type="dxa" w:w="2160"/>
+          </w:tcPr>
+          <w:p>
+            <w:r/>
+            <w:r>
+              <w:rPr>
+                <w:rFonts w:ascii="Calibri" w:hAnsi="Calibri" w:eastAsia="Calibri"/>
+                <w:b w:val="0"/>
+                <w:color w:val="222222"/>
+                <w:sz w:val="16"/>
+              </w:rPr>
+              <w:t>Why removed (e.g. Spam) + staff detail</w:t>
             </w:r>
           </w:p>
         </w:tc>
@@ -11781,7 +11924,7 @@
                 <w:color w:val="222222"/>
                 <w:sz w:val="16"/>
               </w:rPr>
-              <w:t>nvarchar(500)</w:t>
+              <w:t>nvarchar(500) / nvarchar(1000)</w:t>
             </w:r>
           </w:p>
         </w:tc>
@@ -14010,6 +14153,110 @@
                 <w:sz w:val="16"/>
               </w:rPr>
               <w:t>Staff names stored as snapshot strings, deliberately not FKs.</w:t>
+            </w:r>
+          </w:p>
+        </w:tc>
+      </w:tr>
+      <w:tr>
+        <w:tc>
+          <w:tcPr>
+            <w:tcW w:type="dxa" w:w="1440"/>
+          </w:tcPr>
+          <w:p>
+            <w:r/>
+            <w:r>
+              <w:rPr>
+                <w:rFonts w:ascii="Calibri" w:hAnsi="Calibri" w:eastAsia="Calibri"/>
+                <w:b w:val="0"/>
+                <w:color w:val="222222"/>
+                <w:sz w:val="16"/>
+              </w:rPr>
+              <w:t>StayReview</w:t>
+            </w:r>
+          </w:p>
+        </w:tc>
+        <w:tc>
+          <w:tcPr>
+            <w:tcW w:type="dxa" w:w="1440"/>
+          </w:tcPr>
+          <w:p>
+            <w:r/>
+            <w:r>
+              <w:rPr>
+                <w:rFonts w:ascii="Calibri" w:hAnsi="Calibri" w:eastAsia="Calibri"/>
+                <w:b w:val="0"/>
+                <w:color w:val="222222"/>
+                <w:sz w:val="16"/>
+              </w:rPr>
+              <w:t>DeletedBy</w:t>
+            </w:r>
+          </w:p>
+        </w:tc>
+        <w:tc>
+          <w:tcPr>
+            <w:tcW w:type="dxa" w:w="1440"/>
+          </w:tcPr>
+          <w:p>
+            <w:r/>
+            <w:r>
+              <w:rPr>
+                <w:rFonts w:ascii="Calibri" w:hAnsi="Calibri" w:eastAsia="Calibri"/>
+                <w:b w:val="0"/>
+                <w:color w:val="222222"/>
+                <w:sz w:val="16"/>
+              </w:rPr>
+              <w:t>AccountUser</w:t>
+            </w:r>
+          </w:p>
+        </w:tc>
+        <w:tc>
+          <w:tcPr>
+            <w:tcW w:type="dxa" w:w="1440"/>
+          </w:tcPr>
+          <w:p>
+            <w:r/>
+            <w:r>
+              <w:rPr>
+                <w:rFonts w:ascii="Calibri" w:hAnsi="Calibri" w:eastAsia="Calibri"/>
+                <w:b w:val="0"/>
+                <w:color w:val="222222"/>
+                <w:sz w:val="16"/>
+              </w:rPr>
+              <w:t>—</w:t>
+            </w:r>
+          </w:p>
+        </w:tc>
+        <w:tc>
+          <w:tcPr>
+            <w:tcW w:type="dxa" w:w="1440"/>
+          </w:tcPr>
+          <w:p>
+            <w:r/>
+            <w:r>
+              <w:rPr>
+                <w:rFonts w:ascii="Calibri" w:hAnsi="Calibri" w:eastAsia="Calibri"/>
+                <w:b w:val="0"/>
+                <w:color w:val="222222"/>
+                <w:sz w:val="16"/>
+              </w:rPr>
+              <w:t>no FK</w:t>
+            </w:r>
+          </w:p>
+        </w:tc>
+        <w:tc>
+          <w:tcPr>
+            <w:tcW w:type="dxa" w:w="1440"/>
+          </w:tcPr>
+          <w:p>
+            <w:r/>
+            <w:r>
+              <w:rPr>
+                <w:rFonts w:ascii="Calibri" w:hAnsi="Calibri" w:eastAsia="Calibri"/>
+                <w:b w:val="0"/>
+                <w:color w:val="222222"/>
+                <w:sz w:val="16"/>
+              </w:rPr>
+              <w:t>Staff name snapshot for soft-delete — same pattern as payment audit strings.</w:t>
             </w:r>
           </w:p>
         </w:tc>

</xml_diff>

<commit_message>
Add 50% deposit checkout, front-desk payments & attention workflow
- Xendit QRPh/card deposit checkout with auto-confirm, webhooks,
  30-min hold expiry, and method switching
- Front-desk attention: today/tomorrow arrivals only, Bookings vs
  Reservations by payment state, Assign/Payments actions
- In-modal room assignment, cash + QR collection, payment history,
  and demo simulate-payment
- Demo seed: fully-paid today arrivals + deposit-only reservations
</commit_message>
<xml_diff>
--- a/docs/HotelDb-Schema.docx
+++ b/docs/HotelDb-Schema.docx
@@ -41,7 +41,7 @@
           <w:color w:val="0B1F3A"/>
           <w:sz w:val="20"/>
         </w:rPr>
-        <w:t>17 tables. The Identity tables are named Account* (AccountUser, AccountRole, AccountExternalLogin, AccountAuthToken) because they hold staff AND Google guests. PasswordResetCode likewise serves both — every guest sets a local password on first login.</w:t>
+        <w:t>18 tables. The Identity tables are named Account* (AccountUser, AccountRole, AccountExternalLogin, AccountAuthToken) because they hold staff AND Google guests. PasswordResetCode likewise serves both — every guest sets a local password on first login.</w:t>
       </w:r>
     </w:p>
     <w:p>
@@ -651,6 +651,59 @@
                 <w:sz w:val="16"/>
               </w:rPr>
               <w:t>One payment/void event per stay. Corrections are voids, never deletes. Receipt-photo/OCR pipeline removed — payments post manually.</w:t>
+            </w:r>
+          </w:p>
+        </w:tc>
+      </w:tr>
+      <w:tr>
+        <w:tc>
+          <w:tcPr>
+            <w:tcW w:type="dxa" w:w="2880"/>
+          </w:tcPr>
+          <w:p>
+            <w:r/>
+            <w:r>
+              <w:rPr>
+                <w:rFonts w:ascii="Calibri" w:hAnsi="Calibri" w:eastAsia="Calibri"/>
+                <w:b w:val="0"/>
+                <w:color w:val="222222"/>
+                <w:sz w:val="16"/>
+              </w:rPr>
+              <w:t>QrPaymentIntent</w:t>
+            </w:r>
+          </w:p>
+        </w:tc>
+        <w:tc>
+          <w:tcPr>
+            <w:tcW w:type="dxa" w:w="2880"/>
+          </w:tcPr>
+          <w:p>
+            <w:r/>
+            <w:r>
+              <w:rPr>
+                <w:rFonts w:ascii="Calibri" w:hAnsi="Calibri" w:eastAsia="Calibri"/>
+                <w:b w:val="0"/>
+                <w:color w:val="222222"/>
+                <w:sz w:val="16"/>
+              </w:rPr>
+              <w:t>Weak entity</w:t>
+            </w:r>
+          </w:p>
+        </w:tc>
+        <w:tc>
+          <w:tcPr>
+            <w:tcW w:type="dxa" w:w="2880"/>
+          </w:tcPr>
+          <w:p>
+            <w:r/>
+            <w:r>
+              <w:rPr>
+                <w:rFonts w:ascii="Calibri" w:hAnsi="Calibri" w:eastAsia="Calibri"/>
+                <w:b w:val="0"/>
+                <w:color w:val="222222"/>
+                <w:sz w:val="16"/>
+              </w:rPr>
+              <w:t>A Xendit payment intent tied to a stay — front-desk QRPh collection and the guest 50% deposit (QRPh or hosted card checkout). Guest access to an intent is authorized by Booking.GuestPayToken.</w:t>
             </w:r>
           </w:p>
         </w:tc>
@@ -4639,7 +4692,7 @@
                 <w:color w:val="222222"/>
                 <w:sz w:val="16"/>
               </w:rPr>
-              <w:t>Full | Half due at booking</w:t>
+              <w:t>Full | Half due at booking — online guests are Half: 50% deposit to confirm</w:t>
             </w:r>
           </w:p>
         </w:tc>
@@ -5403,6 +5456,355 @@
                 <w:sz w:val="16"/>
               </w:rPr>
               <w:t>Soft-delete to history</w:t>
+            </w:r>
+          </w:p>
+        </w:tc>
+      </w:tr>
+      <w:tr>
+        <w:tc>
+          <w:tcPr>
+            <w:tcW w:type="dxa" w:w="2160"/>
+          </w:tcPr>
+          <w:p>
+            <w:r/>
+            <w:r>
+              <w:rPr>
+                <w:rFonts w:ascii="Calibri" w:hAnsi="Calibri" w:eastAsia="Calibri"/>
+                <w:b w:val="0"/>
+                <w:color w:val="222222"/>
+                <w:sz w:val="16"/>
+              </w:rPr>
+              <w:t>DepositDueAtUtc</w:t>
+            </w:r>
+          </w:p>
+        </w:tc>
+        <w:tc>
+          <w:tcPr>
+            <w:tcW w:type="dxa" w:w="2160"/>
+          </w:tcPr>
+          <w:p>
+            <w:r/>
+            <w:r>
+              <w:rPr>
+                <w:rFonts w:ascii="Calibri" w:hAnsi="Calibri" w:eastAsia="Calibri"/>
+                <w:b w:val="0"/>
+                <w:color w:val="222222"/>
+                <w:sz w:val="16"/>
+              </w:rPr>
+              <w:t>datetime2</w:t>
+            </w:r>
+          </w:p>
+        </w:tc>
+        <w:tc>
+          <w:tcPr>
+            <w:tcW w:type="dxa" w:w="2160"/>
+          </w:tcPr>
+          <w:p>
+            <w:r/>
+            <w:r>
+              <w:rPr>
+                <w:rFonts w:ascii="Calibri" w:hAnsi="Calibri" w:eastAsia="Calibri"/>
+                <w:b w:val="0"/>
+                <w:color w:val="222222"/>
+                <w:sz w:val="16"/>
+              </w:rPr>
+              <w:t>NULL</w:t>
+            </w:r>
+          </w:p>
+        </w:tc>
+        <w:tc>
+          <w:tcPr>
+            <w:tcW w:type="dxa" w:w="2160"/>
+          </w:tcPr>
+          <w:p>
+            <w:r/>
+            <w:r>
+              <w:rPr>
+                <w:rFonts w:ascii="Calibri" w:hAnsi="Calibri" w:eastAsia="Calibri"/>
+                <w:b w:val="0"/>
+                <w:color w:val="222222"/>
+                <w:sz w:val="16"/>
+              </w:rPr>
+              <w:t>50% deposit hold deadline — online bookings get +30 min; unpaid holds auto-cancel</w:t>
+            </w:r>
+          </w:p>
+        </w:tc>
+      </w:tr>
+      <w:tr>
+        <w:tc>
+          <w:tcPr>
+            <w:tcW w:type="dxa" w:w="2160"/>
+          </w:tcPr>
+          <w:p>
+            <w:r/>
+            <w:r>
+              <w:rPr>
+                <w:rFonts w:ascii="Calibri" w:hAnsi="Calibri" w:eastAsia="Calibri"/>
+                <w:b w:val="0"/>
+                <w:color w:val="222222"/>
+                <w:sz w:val="16"/>
+              </w:rPr>
+              <w:t>GuestPayToken</w:t>
+            </w:r>
+          </w:p>
+        </w:tc>
+        <w:tc>
+          <w:tcPr>
+            <w:tcW w:type="dxa" w:w="2160"/>
+          </w:tcPr>
+          <w:p>
+            <w:r/>
+            <w:r>
+              <w:rPr>
+                <w:rFonts w:ascii="Calibri" w:hAnsi="Calibri" w:eastAsia="Calibri"/>
+                <w:b w:val="0"/>
+                <w:color w:val="222222"/>
+                <w:sz w:val="16"/>
+              </w:rPr>
+              <w:t>nvarchar(64)</w:t>
+            </w:r>
+          </w:p>
+        </w:tc>
+        <w:tc>
+          <w:tcPr>
+            <w:tcW w:type="dxa" w:w="2160"/>
+          </w:tcPr>
+          <w:p>
+            <w:r/>
+            <w:r>
+              <w:rPr>
+                <w:rFonts w:ascii="Calibri" w:hAnsi="Calibri" w:eastAsia="Calibri"/>
+                <w:b w:val="0"/>
+                <w:color w:val="222222"/>
+                <w:sz w:val="16"/>
+              </w:rPr>
+              <w:t>NULL, unique filtered idx</w:t>
+            </w:r>
+          </w:p>
+        </w:tc>
+        <w:tc>
+          <w:tcPr>
+            <w:tcW w:type="dxa" w:w="2160"/>
+          </w:tcPr>
+          <w:p>
+            <w:r/>
+            <w:r>
+              <w:rPr>
+                <w:rFonts w:ascii="Calibri" w:hAnsi="Calibri" w:eastAsia="Calibri"/>
+                <w:b w:val="0"/>
+                <w:color w:val="222222"/>
+                <w:sz w:val="16"/>
+              </w:rPr>
+              <w:t>Per-booking secret authorizing the guest deposit endpoints</w:t>
+            </w:r>
+          </w:p>
+        </w:tc>
+      </w:tr>
+      <w:tr>
+        <w:tc>
+          <w:tcPr>
+            <w:tcW w:type="dxa" w:w="2160"/>
+          </w:tcPr>
+          <w:p>
+            <w:r/>
+            <w:r>
+              <w:rPr>
+                <w:rFonts w:ascii="Calibri" w:hAnsi="Calibri" w:eastAsia="Calibri"/>
+                <w:b w:val="0"/>
+                <w:color w:val="222222"/>
+                <w:sz w:val="16"/>
+              </w:rPr>
+              <w:t>GuestEditedFieldsJson</w:t>
+            </w:r>
+          </w:p>
+        </w:tc>
+        <w:tc>
+          <w:tcPr>
+            <w:tcW w:type="dxa" w:w="2160"/>
+          </w:tcPr>
+          <w:p>
+            <w:r/>
+            <w:r>
+              <w:rPr>
+                <w:rFonts w:ascii="Calibri" w:hAnsi="Calibri" w:eastAsia="Calibri"/>
+                <w:b w:val="0"/>
+                <w:color w:val="222222"/>
+                <w:sz w:val="16"/>
+              </w:rPr>
+              <w:t>nvarchar(max)</w:t>
+            </w:r>
+          </w:p>
+        </w:tc>
+        <w:tc>
+          <w:tcPr>
+            <w:tcW w:type="dxa" w:w="2160"/>
+          </w:tcPr>
+          <w:p>
+            <w:r/>
+            <w:r>
+              <w:rPr>
+                <w:rFonts w:ascii="Calibri" w:hAnsi="Calibri" w:eastAsia="Calibri"/>
+                <w:b w:val="0"/>
+                <w:color w:val="222222"/>
+                <w:sz w:val="16"/>
+              </w:rPr>
+              <w:t>NULL, JSON</w:t>
+            </w:r>
+          </w:p>
+        </w:tc>
+        <w:tc>
+          <w:tcPr>
+            <w:tcW w:type="dxa" w:w="2160"/>
+          </w:tcPr>
+          <w:p>
+            <w:r/>
+            <w:r>
+              <w:rPr>
+                <w:rFonts w:ascii="Calibri" w:hAnsi="Calibri" w:eastAsia="Calibri"/>
+                <w:b w:val="0"/>
+                <w:color w:val="222222"/>
+                <w:sz w:val="16"/>
+              </w:rPr>
+              <w:t>Fields the guest edited after booking</w:t>
+            </w:r>
+          </w:p>
+        </w:tc>
+      </w:tr>
+      <w:tr>
+        <w:tc>
+          <w:tcPr>
+            <w:tcW w:type="dxa" w:w="2160"/>
+          </w:tcPr>
+          <w:p>
+            <w:r/>
+            <w:r>
+              <w:rPr>
+                <w:rFonts w:ascii="Calibri" w:hAnsi="Calibri" w:eastAsia="Calibri"/>
+                <w:b w:val="0"/>
+                <w:color w:val="222222"/>
+                <w:sz w:val="16"/>
+              </w:rPr>
+              <w:t>LastGuestEditAtUtc</w:t>
+            </w:r>
+          </w:p>
+        </w:tc>
+        <w:tc>
+          <w:tcPr>
+            <w:tcW w:type="dxa" w:w="2160"/>
+          </w:tcPr>
+          <w:p>
+            <w:r/>
+            <w:r>
+              <w:rPr>
+                <w:rFonts w:ascii="Calibri" w:hAnsi="Calibri" w:eastAsia="Calibri"/>
+                <w:b w:val="0"/>
+                <w:color w:val="222222"/>
+                <w:sz w:val="16"/>
+              </w:rPr>
+              <w:t>datetime2</w:t>
+            </w:r>
+          </w:p>
+        </w:tc>
+        <w:tc>
+          <w:tcPr>
+            <w:tcW w:type="dxa" w:w="2160"/>
+          </w:tcPr>
+          <w:p>
+            <w:r/>
+            <w:r>
+              <w:rPr>
+                <w:rFonts w:ascii="Calibri" w:hAnsi="Calibri" w:eastAsia="Calibri"/>
+                <w:b w:val="0"/>
+                <w:color w:val="222222"/>
+                <w:sz w:val="16"/>
+              </w:rPr>
+              <w:t>NULL</w:t>
+            </w:r>
+          </w:p>
+        </w:tc>
+        <w:tc>
+          <w:tcPr>
+            <w:tcW w:type="dxa" w:w="2160"/>
+          </w:tcPr>
+          <w:p>
+            <w:r/>
+            <w:r>
+              <w:rPr>
+                <w:rFonts w:ascii="Calibri" w:hAnsi="Calibri" w:eastAsia="Calibri"/>
+                <w:b w:val="0"/>
+                <w:color w:val="222222"/>
+                <w:sz w:val="16"/>
+              </w:rPr>
+              <w:t>When the guest last edited</w:t>
+            </w:r>
+          </w:p>
+        </w:tc>
+      </w:tr>
+      <w:tr>
+        <w:tc>
+          <w:tcPr>
+            <w:tcW w:type="dxa" w:w="2160"/>
+          </w:tcPr>
+          <w:p>
+            <w:r/>
+            <w:r>
+              <w:rPr>
+                <w:rFonts w:ascii="Calibri" w:hAnsi="Calibri" w:eastAsia="Calibri"/>
+                <w:b w:val="0"/>
+                <w:color w:val="222222"/>
+                <w:sz w:val="16"/>
+              </w:rPr>
+              <w:t>GuestEditsSeenByStaff</w:t>
+            </w:r>
+          </w:p>
+        </w:tc>
+        <w:tc>
+          <w:tcPr>
+            <w:tcW w:type="dxa" w:w="2160"/>
+          </w:tcPr>
+          <w:p>
+            <w:r/>
+            <w:r>
+              <w:rPr>
+                <w:rFonts w:ascii="Calibri" w:hAnsi="Calibri" w:eastAsia="Calibri"/>
+                <w:b w:val="0"/>
+                <w:color w:val="222222"/>
+                <w:sz w:val="16"/>
+              </w:rPr>
+              <w:t>bit</w:t>
+            </w:r>
+          </w:p>
+        </w:tc>
+        <w:tc>
+          <w:tcPr>
+            <w:tcW w:type="dxa" w:w="2160"/>
+          </w:tcPr>
+          <w:p>
+            <w:r/>
+            <w:r>
+              <w:rPr>
+                <w:rFonts w:ascii="Calibri" w:hAnsi="Calibri" w:eastAsia="Calibri"/>
+                <w:b w:val="0"/>
+                <w:color w:val="222222"/>
+                <w:sz w:val="16"/>
+              </w:rPr>
+            </w:r>
+          </w:p>
+        </w:tc>
+        <w:tc>
+          <w:tcPr>
+            <w:tcW w:type="dxa" w:w="2160"/>
+          </w:tcPr>
+          <w:p>
+            <w:r/>
+            <w:r>
+              <w:rPr>
+                <w:rFonts w:ascii="Calibri" w:hAnsi="Calibri" w:eastAsia="Calibri"/>
+                <w:b w:val="0"/>
+                <w:color w:val="222222"/>
+                <w:sz w:val="16"/>
+              </w:rPr>
+              <w:t>Cleared on guest edit; set when staff reviews it</w:t>
             </w:r>
           </w:p>
         </w:tc>
@@ -7385,7 +7787,7 @@
                 <w:color w:val="222222"/>
                 <w:sz w:val="16"/>
               </w:rPr>
-              <w:t>Cash | EWallet | Other (+ legacy Card/BankTransfer/Maya)</w:t>
+              <w:t>Cash | EWallet | Card (Xendit deposit) | Other (+ legacy BankTransfer/Maya)</w:t>
             </w:r>
           </w:p>
         </w:tc>
@@ -8011,6 +8413,1375 @@
                 <w:sz w:val="16"/>
               </w:rPr>
               <w:t>Free text (e.g., cash change given)</w:t>
+            </w:r>
+          </w:p>
+        </w:tc>
+      </w:tr>
+    </w:tbl>
+    <w:p>
+      <w:pPr>
+        <w:pStyle w:val="Heading3"/>
+      </w:pPr>
+      <w:r>
+        <w:rPr>
+          <w:rFonts w:ascii="Calibri" w:hAnsi="Calibri" w:eastAsia="Calibri"/>
+          <w:b/>
+          <w:color w:val="0D9488"/>
+          <w:sz w:val="24"/>
+        </w:rPr>
+        <w:t>QrPaymentIntent  (Weak entity)</w:t>
+      </w:r>
+    </w:p>
+    <w:p>
+      <w:pPr>
+        <w:spacing w:after="120"/>
+      </w:pPr>
+      <w:r>
+        <w:rPr>
+          <w:rFonts w:ascii="Calibri" w:hAnsi="Calibri" w:eastAsia="Calibri"/>
+          <w:b w:val="0"/>
+          <w:color w:val="0B1F3A"/>
+          <w:sz w:val="18"/>
+        </w:rPr>
+        <w:t>A Xendit payment intent tied to a stay — front-desk QRPh collection and the guest 50% deposit (QRPh or hosted card checkout). Guest access to an intent is authorized by Booking.GuestPayToken.</w:t>
+      </w:r>
+    </w:p>
+    <w:tbl>
+      <w:tblPr>
+        <w:tblStyle w:val="TableGrid"/>
+        <w:tblW w:type="auto" w:w="0"/>
+        <w:tblLook w:firstColumn="1" w:firstRow="1" w:lastColumn="0" w:lastRow="0" w:noHBand="0" w:noVBand="1" w:val="04A0"/>
+      </w:tblPr>
+      <w:tblGrid>
+        <w:gridCol w:w="2160"/>
+        <w:gridCol w:w="2160"/>
+        <w:gridCol w:w="2160"/>
+        <w:gridCol w:w="2160"/>
+      </w:tblGrid>
+      <w:tr>
+        <w:tc>
+          <w:tcPr>
+            <w:tcW w:type="dxa" w:w="2160"/>
+            <w:shd w:fill="D9EDED" w:val="clear"/>
+          </w:tcPr>
+          <w:p>
+            <w:r/>
+            <w:r>
+              <w:rPr>
+                <w:rFonts w:ascii="Calibri" w:hAnsi="Calibri" w:eastAsia="Calibri"/>
+                <w:b/>
+                <w:color w:val="0B1F3A"/>
+                <w:sz w:val="16"/>
+              </w:rPr>
+              <w:t>Attribute</w:t>
+            </w:r>
+          </w:p>
+        </w:tc>
+        <w:tc>
+          <w:tcPr>
+            <w:tcW w:type="dxa" w:w="2160"/>
+            <w:shd w:fill="D9EDED" w:val="clear"/>
+          </w:tcPr>
+          <w:p>
+            <w:r/>
+            <w:r>
+              <w:rPr>
+                <w:rFonts w:ascii="Calibri" w:hAnsi="Calibri" w:eastAsia="Calibri"/>
+                <w:b/>
+                <w:color w:val="0B1F3A"/>
+                <w:sz w:val="16"/>
+              </w:rPr>
+              <w:t>Type</w:t>
+            </w:r>
+          </w:p>
+        </w:tc>
+        <w:tc>
+          <w:tcPr>
+            <w:tcW w:type="dxa" w:w="2160"/>
+            <w:shd w:fill="D9EDED" w:val="clear"/>
+          </w:tcPr>
+          <w:p>
+            <w:r/>
+            <w:r>
+              <w:rPr>
+                <w:rFonts w:ascii="Calibri" w:hAnsi="Calibri" w:eastAsia="Calibri"/>
+                <w:b/>
+                <w:color w:val="0B1F3A"/>
+                <w:sz w:val="16"/>
+              </w:rPr>
+              <w:t>Key / Null</w:t>
+            </w:r>
+          </w:p>
+        </w:tc>
+        <w:tc>
+          <w:tcPr>
+            <w:tcW w:type="dxa" w:w="2160"/>
+            <w:shd w:fill="D9EDED" w:val="clear"/>
+          </w:tcPr>
+          <w:p>
+            <w:r/>
+            <w:r>
+              <w:rPr>
+                <w:rFonts w:ascii="Calibri" w:hAnsi="Calibri" w:eastAsia="Calibri"/>
+                <w:b/>
+                <w:color w:val="0B1F3A"/>
+                <w:sz w:val="16"/>
+              </w:rPr>
+              <w:t>Notes</w:t>
+            </w:r>
+          </w:p>
+        </w:tc>
+      </w:tr>
+      <w:tr>
+        <w:tc>
+          <w:tcPr>
+            <w:tcW w:type="dxa" w:w="2160"/>
+          </w:tcPr>
+          <w:p>
+            <w:r/>
+            <w:r>
+              <w:rPr>
+                <w:rFonts w:ascii="Calibri" w:hAnsi="Calibri" w:eastAsia="Calibri"/>
+                <w:b w:val="0"/>
+                <w:color w:val="222222"/>
+                <w:sz w:val="16"/>
+              </w:rPr>
+              <w:t>Id</w:t>
+            </w:r>
+          </w:p>
+        </w:tc>
+        <w:tc>
+          <w:tcPr>
+            <w:tcW w:type="dxa" w:w="2160"/>
+          </w:tcPr>
+          <w:p>
+            <w:r/>
+            <w:r>
+              <w:rPr>
+                <w:rFonts w:ascii="Calibri" w:hAnsi="Calibri" w:eastAsia="Calibri"/>
+                <w:b w:val="0"/>
+                <w:color w:val="222222"/>
+                <w:sz w:val="16"/>
+              </w:rPr>
+              <w:t>int</w:t>
+            </w:r>
+          </w:p>
+        </w:tc>
+        <w:tc>
+          <w:tcPr>
+            <w:tcW w:type="dxa" w:w="2160"/>
+          </w:tcPr>
+          <w:p>
+            <w:r/>
+            <w:r>
+              <w:rPr>
+                <w:rFonts w:ascii="Calibri" w:hAnsi="Calibri" w:eastAsia="Calibri"/>
+                <w:b w:val="0"/>
+                <w:color w:val="222222"/>
+                <w:sz w:val="16"/>
+              </w:rPr>
+              <w:t>PK, identity</w:t>
+            </w:r>
+          </w:p>
+        </w:tc>
+        <w:tc>
+          <w:tcPr>
+            <w:tcW w:type="dxa" w:w="2160"/>
+          </w:tcPr>
+          <w:p>
+            <w:r/>
+            <w:r>
+              <w:rPr>
+                <w:rFonts w:ascii="Calibri" w:hAnsi="Calibri" w:eastAsia="Calibri"/>
+                <w:b w:val="0"/>
+                <w:color w:val="222222"/>
+                <w:sz w:val="16"/>
+              </w:rPr>
+            </w:r>
+          </w:p>
+        </w:tc>
+      </w:tr>
+      <w:tr>
+        <w:tc>
+          <w:tcPr>
+            <w:tcW w:type="dxa" w:w="2160"/>
+          </w:tcPr>
+          <w:p>
+            <w:r/>
+            <w:r>
+              <w:rPr>
+                <w:rFonts w:ascii="Calibri" w:hAnsi="Calibri" w:eastAsia="Calibri"/>
+                <w:b w:val="0"/>
+                <w:color w:val="222222"/>
+                <w:sz w:val="16"/>
+              </w:rPr>
+              <w:t>BookingId</w:t>
+            </w:r>
+          </w:p>
+        </w:tc>
+        <w:tc>
+          <w:tcPr>
+            <w:tcW w:type="dxa" w:w="2160"/>
+          </w:tcPr>
+          <w:p>
+            <w:r/>
+            <w:r>
+              <w:rPr>
+                <w:rFonts w:ascii="Calibri" w:hAnsi="Calibri" w:eastAsia="Calibri"/>
+                <w:b w:val="0"/>
+                <w:color w:val="222222"/>
+                <w:sz w:val="16"/>
+              </w:rPr>
+              <w:t>int</w:t>
+            </w:r>
+          </w:p>
+        </w:tc>
+        <w:tc>
+          <w:tcPr>
+            <w:tcW w:type="dxa" w:w="2160"/>
+          </w:tcPr>
+          <w:p>
+            <w:r/>
+            <w:r>
+              <w:rPr>
+                <w:rFonts w:ascii="Calibri" w:hAnsi="Calibri" w:eastAsia="Calibri"/>
+                <w:b w:val="0"/>
+                <w:color w:val="222222"/>
+                <w:sz w:val="16"/>
+              </w:rPr>
+              <w:t>FK → Booking, RESTRICT, indexed</w:t>
+            </w:r>
+          </w:p>
+        </w:tc>
+        <w:tc>
+          <w:tcPr>
+            <w:tcW w:type="dxa" w:w="2160"/>
+          </w:tcPr>
+          <w:p>
+            <w:r/>
+            <w:r>
+              <w:rPr>
+                <w:rFonts w:ascii="Calibri" w:hAnsi="Calibri" w:eastAsia="Calibri"/>
+                <w:b w:val="0"/>
+                <w:color w:val="222222"/>
+                <w:sz w:val="16"/>
+              </w:rPr>
+              <w:t>Owning stay</w:t>
+            </w:r>
+          </w:p>
+        </w:tc>
+      </w:tr>
+      <w:tr>
+        <w:tc>
+          <w:tcPr>
+            <w:tcW w:type="dxa" w:w="2160"/>
+          </w:tcPr>
+          <w:p>
+            <w:r/>
+            <w:r>
+              <w:rPr>
+                <w:rFonts w:ascii="Calibri" w:hAnsi="Calibri" w:eastAsia="Calibri"/>
+                <w:b w:val="0"/>
+                <w:color w:val="222222"/>
+                <w:sz w:val="16"/>
+              </w:rPr>
+              <w:t>ReferenceId</w:t>
+            </w:r>
+          </w:p>
+        </w:tc>
+        <w:tc>
+          <w:tcPr>
+            <w:tcW w:type="dxa" w:w="2160"/>
+          </w:tcPr>
+          <w:p>
+            <w:r/>
+            <w:r>
+              <w:rPr>
+                <w:rFonts w:ascii="Calibri" w:hAnsi="Calibri" w:eastAsia="Calibri"/>
+                <w:b w:val="0"/>
+                <w:color w:val="222222"/>
+                <w:sz w:val="16"/>
+              </w:rPr>
+              <w:t>nvarchar(64)</w:t>
+            </w:r>
+          </w:p>
+        </w:tc>
+        <w:tc>
+          <w:tcPr>
+            <w:tcW w:type="dxa" w:w="2160"/>
+          </w:tcPr>
+          <w:p>
+            <w:r/>
+            <w:r>
+              <w:rPr>
+                <w:rFonts w:ascii="Calibri" w:hAnsi="Calibri" w:eastAsia="Calibri"/>
+                <w:b w:val="0"/>
+                <w:color w:val="222222"/>
+                <w:sz w:val="16"/>
+              </w:rPr>
+              <w:t>unique</w:t>
+            </w:r>
+          </w:p>
+        </w:tc>
+        <w:tc>
+          <w:tcPr>
+            <w:tcW w:type="dxa" w:w="2160"/>
+          </w:tcPr>
+          <w:p>
+            <w:r/>
+            <w:r>
+              <w:rPr>
+                <w:rFonts w:ascii="Calibri" w:hAnsi="Calibri" w:eastAsia="Calibri"/>
+                <w:b w:val="0"/>
+                <w:color w:val="222222"/>
+                <w:sz w:val="16"/>
+              </w:rPr>
+              <w:t>Our idempotency reference sent to Xendit (MORI-{booking ref}-{8 hex})</w:t>
+            </w:r>
+          </w:p>
+        </w:tc>
+      </w:tr>
+      <w:tr>
+        <w:tc>
+          <w:tcPr>
+            <w:tcW w:type="dxa" w:w="2160"/>
+          </w:tcPr>
+          <w:p>
+            <w:r/>
+            <w:r>
+              <w:rPr>
+                <w:rFonts w:ascii="Calibri" w:hAnsi="Calibri" w:eastAsia="Calibri"/>
+                <w:b w:val="0"/>
+                <w:color w:val="222222"/>
+                <w:sz w:val="16"/>
+              </w:rPr>
+              <w:t>XenditPaymentRequestId</w:t>
+            </w:r>
+          </w:p>
+        </w:tc>
+        <w:tc>
+          <w:tcPr>
+            <w:tcW w:type="dxa" w:w="2160"/>
+          </w:tcPr>
+          <w:p>
+            <w:r/>
+            <w:r>
+              <w:rPr>
+                <w:rFonts w:ascii="Calibri" w:hAnsi="Calibri" w:eastAsia="Calibri"/>
+                <w:b w:val="0"/>
+                <w:color w:val="222222"/>
+                <w:sz w:val="16"/>
+              </w:rPr>
+              <w:t>nvarchar(64)</w:t>
+            </w:r>
+          </w:p>
+        </w:tc>
+        <w:tc>
+          <w:tcPr>
+            <w:tcW w:type="dxa" w:w="2160"/>
+          </w:tcPr>
+          <w:p>
+            <w:r/>
+            <w:r>
+              <w:rPr>
+                <w:rFonts w:ascii="Calibri" w:hAnsi="Calibri" w:eastAsia="Calibri"/>
+                <w:b w:val="0"/>
+                <w:color w:val="222222"/>
+                <w:sz w:val="16"/>
+              </w:rPr>
+              <w:t>NULL, unique filtered</w:t>
+            </w:r>
+          </w:p>
+        </w:tc>
+        <w:tc>
+          <w:tcPr>
+            <w:tcW w:type="dxa" w:w="2160"/>
+          </w:tcPr>
+          <w:p>
+            <w:r/>
+            <w:r>
+              <w:rPr>
+                <w:rFonts w:ascii="Calibri" w:hAnsi="Calibri" w:eastAsia="Calibri"/>
+                <w:b w:val="0"/>
+                <w:color w:val="222222"/>
+                <w:sz w:val="16"/>
+              </w:rPr>
+              <w:t>QRPh payment_request_id — null for Card</w:t>
+            </w:r>
+          </w:p>
+        </w:tc>
+      </w:tr>
+      <w:tr>
+        <w:tc>
+          <w:tcPr>
+            <w:tcW w:type="dxa" w:w="2160"/>
+          </w:tcPr>
+          <w:p>
+            <w:r/>
+            <w:r>
+              <w:rPr>
+                <w:rFonts w:ascii="Calibri" w:hAnsi="Calibri" w:eastAsia="Calibri"/>
+                <w:b w:val="0"/>
+                <w:color w:val="222222"/>
+                <w:sz w:val="16"/>
+              </w:rPr>
+              <w:t>XenditInvoiceId</w:t>
+            </w:r>
+          </w:p>
+        </w:tc>
+        <w:tc>
+          <w:tcPr>
+            <w:tcW w:type="dxa" w:w="2160"/>
+          </w:tcPr>
+          <w:p>
+            <w:r/>
+            <w:r>
+              <w:rPr>
+                <w:rFonts w:ascii="Calibri" w:hAnsi="Calibri" w:eastAsia="Calibri"/>
+                <w:b w:val="0"/>
+                <w:color w:val="222222"/>
+                <w:sz w:val="16"/>
+              </w:rPr>
+              <w:t>nvarchar(64)</w:t>
+            </w:r>
+          </w:p>
+        </w:tc>
+        <w:tc>
+          <w:tcPr>
+            <w:tcW w:type="dxa" w:w="2160"/>
+          </w:tcPr>
+          <w:p>
+            <w:r/>
+            <w:r>
+              <w:rPr>
+                <w:rFonts w:ascii="Calibri" w:hAnsi="Calibri" w:eastAsia="Calibri"/>
+                <w:b w:val="0"/>
+                <w:color w:val="222222"/>
+                <w:sz w:val="16"/>
+              </w:rPr>
+              <w:t>NULL, unique filtered</w:t>
+            </w:r>
+          </w:p>
+        </w:tc>
+        <w:tc>
+          <w:tcPr>
+            <w:tcW w:type="dxa" w:w="2160"/>
+          </w:tcPr>
+          <w:p>
+            <w:r/>
+            <w:r>
+              <w:rPr>
+                <w:rFonts w:ascii="Calibri" w:hAnsi="Calibri" w:eastAsia="Calibri"/>
+                <w:b w:val="0"/>
+                <w:color w:val="222222"/>
+                <w:sz w:val="16"/>
+              </w:rPr>
+              <w:t>Hosted-invoice id — Card channel only</w:t>
+            </w:r>
+          </w:p>
+        </w:tc>
+      </w:tr>
+      <w:tr>
+        <w:tc>
+          <w:tcPr>
+            <w:tcW w:type="dxa" w:w="2160"/>
+          </w:tcPr>
+          <w:p>
+            <w:r/>
+            <w:r>
+              <w:rPr>
+                <w:rFonts w:ascii="Calibri" w:hAnsi="Calibri" w:eastAsia="Calibri"/>
+                <w:b w:val="0"/>
+                <w:color w:val="222222"/>
+                <w:sz w:val="16"/>
+              </w:rPr>
+              <w:t>XenditPaymentId</w:t>
+            </w:r>
+          </w:p>
+        </w:tc>
+        <w:tc>
+          <w:tcPr>
+            <w:tcW w:type="dxa" w:w="2160"/>
+          </w:tcPr>
+          <w:p>
+            <w:r/>
+            <w:r>
+              <w:rPr>
+                <w:rFonts w:ascii="Calibri" w:hAnsi="Calibri" w:eastAsia="Calibri"/>
+                <w:b w:val="0"/>
+                <w:color w:val="222222"/>
+                <w:sz w:val="16"/>
+              </w:rPr>
+              <w:t>nvarchar(64)</w:t>
+            </w:r>
+          </w:p>
+        </w:tc>
+        <w:tc>
+          <w:tcPr>
+            <w:tcW w:type="dxa" w:w="2160"/>
+          </w:tcPr>
+          <w:p>
+            <w:r/>
+            <w:r>
+              <w:rPr>
+                <w:rFonts w:ascii="Calibri" w:hAnsi="Calibri" w:eastAsia="Calibri"/>
+                <w:b w:val="0"/>
+                <w:color w:val="222222"/>
+                <w:sz w:val="16"/>
+              </w:rPr>
+              <w:t>NULL, unique filtered</w:t>
+            </w:r>
+          </w:p>
+        </w:tc>
+        <w:tc>
+          <w:tcPr>
+            <w:tcW w:type="dxa" w:w="2160"/>
+          </w:tcPr>
+          <w:p>
+            <w:r/>
+            <w:r>
+              <w:rPr>
+                <w:rFonts w:ascii="Calibri" w:hAnsi="Calibri" w:eastAsia="Calibri"/>
+                <w:b w:val="0"/>
+                <w:color w:val="222222"/>
+                <w:sz w:val="16"/>
+              </w:rPr>
+              <w:t>Captured payment id — unique index enforces post-once posting</w:t>
+            </w:r>
+          </w:p>
+        </w:tc>
+      </w:tr>
+      <w:tr>
+        <w:tc>
+          <w:tcPr>
+            <w:tcW w:type="dxa" w:w="2160"/>
+          </w:tcPr>
+          <w:p>
+            <w:r/>
+            <w:r>
+              <w:rPr>
+                <w:rFonts w:ascii="Calibri" w:hAnsi="Calibri" w:eastAsia="Calibri"/>
+                <w:b w:val="0"/>
+                <w:color w:val="222222"/>
+                <w:sz w:val="16"/>
+              </w:rPr>
+              <w:t>Channel</w:t>
+            </w:r>
+          </w:p>
+        </w:tc>
+        <w:tc>
+          <w:tcPr>
+            <w:tcW w:type="dxa" w:w="2160"/>
+          </w:tcPr>
+          <w:p>
+            <w:r/>
+            <w:r>
+              <w:rPr>
+                <w:rFonts w:ascii="Calibri" w:hAnsi="Calibri" w:eastAsia="Calibri"/>
+                <w:b w:val="0"/>
+                <w:color w:val="222222"/>
+                <w:sz w:val="16"/>
+              </w:rPr>
+              <w:t>int</w:t>
+            </w:r>
+          </w:p>
+        </w:tc>
+        <w:tc>
+          <w:tcPr>
+            <w:tcW w:type="dxa" w:w="2160"/>
+          </w:tcPr>
+          <w:p>
+            <w:r/>
+            <w:r>
+              <w:rPr>
+                <w:rFonts w:ascii="Calibri" w:hAnsi="Calibri" w:eastAsia="Calibri"/>
+                <w:b w:val="0"/>
+                <w:color w:val="222222"/>
+                <w:sz w:val="16"/>
+              </w:rPr>
+              <w:t>enum-as-int</w:t>
+            </w:r>
+          </w:p>
+        </w:tc>
+        <w:tc>
+          <w:tcPr>
+            <w:tcW w:type="dxa" w:w="2160"/>
+          </w:tcPr>
+          <w:p>
+            <w:r/>
+            <w:r>
+              <w:rPr>
+                <w:rFonts w:ascii="Calibri" w:hAnsi="Calibri" w:eastAsia="Calibri"/>
+                <w:b w:val="0"/>
+                <w:color w:val="222222"/>
+                <w:sz w:val="16"/>
+              </w:rPr>
+              <w:t>QrPh(0) | Card(1)</w:t>
+            </w:r>
+          </w:p>
+        </w:tc>
+      </w:tr>
+      <w:tr>
+        <w:tc>
+          <w:tcPr>
+            <w:tcW w:type="dxa" w:w="2160"/>
+          </w:tcPr>
+          <w:p>
+            <w:r/>
+            <w:r>
+              <w:rPr>
+                <w:rFonts w:ascii="Calibri" w:hAnsi="Calibri" w:eastAsia="Calibri"/>
+                <w:b w:val="0"/>
+                <w:color w:val="222222"/>
+                <w:sz w:val="16"/>
+              </w:rPr>
+              <w:t>EventType</w:t>
+            </w:r>
+          </w:p>
+        </w:tc>
+        <w:tc>
+          <w:tcPr>
+            <w:tcW w:type="dxa" w:w="2160"/>
+          </w:tcPr>
+          <w:p>
+            <w:r/>
+            <w:r>
+              <w:rPr>
+                <w:rFonts w:ascii="Calibri" w:hAnsi="Calibri" w:eastAsia="Calibri"/>
+                <w:b w:val="0"/>
+                <w:color w:val="222222"/>
+                <w:sz w:val="16"/>
+              </w:rPr>
+              <w:t>int</w:t>
+            </w:r>
+          </w:p>
+        </w:tc>
+        <w:tc>
+          <w:tcPr>
+            <w:tcW w:type="dxa" w:w="2160"/>
+          </w:tcPr>
+          <w:p>
+            <w:r/>
+            <w:r>
+              <w:rPr>
+                <w:rFonts w:ascii="Calibri" w:hAnsi="Calibri" w:eastAsia="Calibri"/>
+                <w:b w:val="0"/>
+                <w:color w:val="222222"/>
+                <w:sz w:val="16"/>
+              </w:rPr>
+              <w:t>enum-as-int, default ArrivalPayment, sentinel -1</w:t>
+            </w:r>
+          </w:p>
+        </w:tc>
+        <w:tc>
+          <w:tcPr>
+            <w:tcW w:type="dxa" w:w="2160"/>
+          </w:tcPr>
+          <w:p>
+            <w:r/>
+            <w:r>
+              <w:rPr>
+                <w:rFonts w:ascii="Calibri" w:hAnsi="Calibri" w:eastAsia="Calibri"/>
+                <w:b w:val="0"/>
+                <w:color w:val="222222"/>
+                <w:sz w:val="16"/>
+              </w:rPr>
+              <w:t>Ledger event posted when paid — Deposit(0) guest checkout | ArrivalPayment(1) front desk</w:t>
+            </w:r>
+          </w:p>
+        </w:tc>
+      </w:tr>
+      <w:tr>
+        <w:tc>
+          <w:tcPr>
+            <w:tcW w:type="dxa" w:w="2160"/>
+          </w:tcPr>
+          <w:p>
+            <w:r/>
+            <w:r>
+              <w:rPr>
+                <w:rFonts w:ascii="Calibri" w:hAnsi="Calibri" w:eastAsia="Calibri"/>
+                <w:b w:val="0"/>
+                <w:color w:val="222222"/>
+                <w:sz w:val="16"/>
+              </w:rPr>
+              <w:t>Amount / Currency</w:t>
+            </w:r>
+          </w:p>
+        </w:tc>
+        <w:tc>
+          <w:tcPr>
+            <w:tcW w:type="dxa" w:w="2160"/>
+          </w:tcPr>
+          <w:p>
+            <w:r/>
+            <w:r>
+              <w:rPr>
+                <w:rFonts w:ascii="Calibri" w:hAnsi="Calibri" w:eastAsia="Calibri"/>
+                <w:b w:val="0"/>
+                <w:color w:val="222222"/>
+                <w:sz w:val="16"/>
+              </w:rPr>
+              <w:t>decimal(18,2) / nvarchar(3)</w:t>
+            </w:r>
+          </w:p>
+        </w:tc>
+        <w:tc>
+          <w:tcPr>
+            <w:tcW w:type="dxa" w:w="2160"/>
+          </w:tcPr>
+          <w:p>
+            <w:r/>
+            <w:r>
+              <w:rPr>
+                <w:rFonts w:ascii="Calibri" w:hAnsi="Calibri" w:eastAsia="Calibri"/>
+                <w:b w:val="0"/>
+                <w:color w:val="222222"/>
+                <w:sz w:val="16"/>
+              </w:rPr>
+            </w:r>
+          </w:p>
+        </w:tc>
+        <w:tc>
+          <w:tcPr>
+            <w:tcW w:type="dxa" w:w="2160"/>
+          </w:tcPr>
+          <w:p>
+            <w:r/>
+            <w:r>
+              <w:rPr>
+                <w:rFonts w:ascii="Calibri" w:hAnsi="Calibri" w:eastAsia="Calibri"/>
+                <w:b w:val="0"/>
+                <w:color w:val="222222"/>
+                <w:sz w:val="16"/>
+              </w:rPr>
+              <w:t>Intent amount, PHP</w:t>
+            </w:r>
+          </w:p>
+        </w:tc>
+      </w:tr>
+      <w:tr>
+        <w:tc>
+          <w:tcPr>
+            <w:tcW w:type="dxa" w:w="2160"/>
+          </w:tcPr>
+          <w:p>
+            <w:r/>
+            <w:r>
+              <w:rPr>
+                <w:rFonts w:ascii="Calibri" w:hAnsi="Calibri" w:eastAsia="Calibri"/>
+                <w:b w:val="0"/>
+                <w:color w:val="222222"/>
+                <w:sz w:val="16"/>
+              </w:rPr>
+              <w:t>Status</w:t>
+            </w:r>
+          </w:p>
+        </w:tc>
+        <w:tc>
+          <w:tcPr>
+            <w:tcW w:type="dxa" w:w="2160"/>
+          </w:tcPr>
+          <w:p>
+            <w:r/>
+            <w:r>
+              <w:rPr>
+                <w:rFonts w:ascii="Calibri" w:hAnsi="Calibri" w:eastAsia="Calibri"/>
+                <w:b w:val="0"/>
+                <w:color w:val="222222"/>
+                <w:sz w:val="16"/>
+              </w:rPr>
+              <w:t>nvarchar(20)</w:t>
+            </w:r>
+          </w:p>
+        </w:tc>
+        <w:tc>
+          <w:tcPr>
+            <w:tcW w:type="dxa" w:w="2160"/>
+          </w:tcPr>
+          <w:p>
+            <w:r/>
+            <w:r>
+              <w:rPr>
+                <w:rFonts w:ascii="Calibri" w:hAnsi="Calibri" w:eastAsia="Calibri"/>
+                <w:b w:val="0"/>
+                <w:color w:val="222222"/>
+                <w:sz w:val="16"/>
+              </w:rPr>
+            </w:r>
+          </w:p>
+        </w:tc>
+        <w:tc>
+          <w:tcPr>
+            <w:tcW w:type="dxa" w:w="2160"/>
+          </w:tcPr>
+          <w:p>
+            <w:r/>
+            <w:r>
+              <w:rPr>
+                <w:rFonts w:ascii="Calibri" w:hAnsi="Calibri" w:eastAsia="Calibri"/>
+                <w:b w:val="0"/>
+                <w:color w:val="222222"/>
+                <w:sz w:val="16"/>
+              </w:rPr>
+              <w:t>Pending | Processing | Paid | Failed | Expired | Cancelled</w:t>
+            </w:r>
+          </w:p>
+        </w:tc>
+      </w:tr>
+      <w:tr>
+        <w:tc>
+          <w:tcPr>
+            <w:tcW w:type="dxa" w:w="2160"/>
+          </w:tcPr>
+          <w:p>
+            <w:r/>
+            <w:r>
+              <w:rPr>
+                <w:rFonts w:ascii="Calibri" w:hAnsi="Calibri" w:eastAsia="Calibri"/>
+                <w:b w:val="0"/>
+                <w:color w:val="222222"/>
+                <w:sz w:val="16"/>
+              </w:rPr>
+              <w:t>QrString</w:t>
+            </w:r>
+          </w:p>
+        </w:tc>
+        <w:tc>
+          <w:tcPr>
+            <w:tcW w:type="dxa" w:w="2160"/>
+          </w:tcPr>
+          <w:p>
+            <w:r/>
+            <w:r>
+              <w:rPr>
+                <w:rFonts w:ascii="Calibri" w:hAnsi="Calibri" w:eastAsia="Calibri"/>
+                <w:b w:val="0"/>
+                <w:color w:val="222222"/>
+                <w:sz w:val="16"/>
+              </w:rPr>
+              <w:t>nvarchar(max)</w:t>
+            </w:r>
+          </w:p>
+        </w:tc>
+        <w:tc>
+          <w:tcPr>
+            <w:tcW w:type="dxa" w:w="2160"/>
+          </w:tcPr>
+          <w:p>
+            <w:r/>
+            <w:r>
+              <w:rPr>
+                <w:rFonts w:ascii="Calibri" w:hAnsi="Calibri" w:eastAsia="Calibri"/>
+                <w:b w:val="0"/>
+                <w:color w:val="222222"/>
+                <w:sz w:val="16"/>
+              </w:rPr>
+              <w:t>NULL</w:t>
+            </w:r>
+          </w:p>
+        </w:tc>
+        <w:tc>
+          <w:tcPr>
+            <w:tcW w:type="dxa" w:w="2160"/>
+          </w:tcPr>
+          <w:p>
+            <w:r/>
+            <w:r>
+              <w:rPr>
+                <w:rFonts w:ascii="Calibri" w:hAnsi="Calibri" w:eastAsia="Calibri"/>
+                <w:b w:val="0"/>
+                <w:color w:val="222222"/>
+                <w:sz w:val="16"/>
+              </w:rPr>
+              <w:t>EMV QR payload — QRPh only; null for Card</w:t>
+            </w:r>
+          </w:p>
+        </w:tc>
+      </w:tr>
+      <w:tr>
+        <w:tc>
+          <w:tcPr>
+            <w:tcW w:type="dxa" w:w="2160"/>
+          </w:tcPr>
+          <w:p>
+            <w:r/>
+            <w:r>
+              <w:rPr>
+                <w:rFonts w:ascii="Calibri" w:hAnsi="Calibri" w:eastAsia="Calibri"/>
+                <w:b w:val="0"/>
+                <w:color w:val="222222"/>
+                <w:sz w:val="16"/>
+              </w:rPr>
+              <w:t>CheckoutUrl</w:t>
+            </w:r>
+          </w:p>
+        </w:tc>
+        <w:tc>
+          <w:tcPr>
+            <w:tcW w:type="dxa" w:w="2160"/>
+          </w:tcPr>
+          <w:p>
+            <w:r/>
+            <w:r>
+              <w:rPr>
+                <w:rFonts w:ascii="Calibri" w:hAnsi="Calibri" w:eastAsia="Calibri"/>
+                <w:b w:val="0"/>
+                <w:color w:val="222222"/>
+                <w:sz w:val="16"/>
+              </w:rPr>
+              <w:t>nvarchar(512)</w:t>
+            </w:r>
+          </w:p>
+        </w:tc>
+        <w:tc>
+          <w:tcPr>
+            <w:tcW w:type="dxa" w:w="2160"/>
+          </w:tcPr>
+          <w:p>
+            <w:r/>
+            <w:r>
+              <w:rPr>
+                <w:rFonts w:ascii="Calibri" w:hAnsi="Calibri" w:eastAsia="Calibri"/>
+                <w:b w:val="0"/>
+                <w:color w:val="222222"/>
+                <w:sz w:val="16"/>
+              </w:rPr>
+              <w:t>NULL</w:t>
+            </w:r>
+          </w:p>
+        </w:tc>
+        <w:tc>
+          <w:tcPr>
+            <w:tcW w:type="dxa" w:w="2160"/>
+          </w:tcPr>
+          <w:p>
+            <w:r/>
+            <w:r>
+              <w:rPr>
+                <w:rFonts w:ascii="Calibri" w:hAnsi="Calibri" w:eastAsia="Calibri"/>
+                <w:b w:val="0"/>
+                <w:color w:val="222222"/>
+                <w:sz w:val="16"/>
+              </w:rPr>
+              <w:t>Xendit hosted-checkout redirect — Card only</w:t>
+            </w:r>
+          </w:p>
+        </w:tc>
+      </w:tr>
+      <w:tr>
+        <w:tc>
+          <w:tcPr>
+            <w:tcW w:type="dxa" w:w="2160"/>
+          </w:tcPr>
+          <w:p>
+            <w:r/>
+            <w:r>
+              <w:rPr>
+                <w:rFonts w:ascii="Calibri" w:hAnsi="Calibri" w:eastAsia="Calibri"/>
+                <w:b w:val="0"/>
+                <w:color w:val="222222"/>
+                <w:sz w:val="16"/>
+              </w:rPr>
+              <w:t>ExpiresAtUtc / PaidAtUtc</w:t>
+            </w:r>
+          </w:p>
+        </w:tc>
+        <w:tc>
+          <w:tcPr>
+            <w:tcW w:type="dxa" w:w="2160"/>
+          </w:tcPr>
+          <w:p>
+            <w:r/>
+            <w:r>
+              <w:rPr>
+                <w:rFonts w:ascii="Calibri" w:hAnsi="Calibri" w:eastAsia="Calibri"/>
+                <w:b w:val="0"/>
+                <w:color w:val="222222"/>
+                <w:sz w:val="16"/>
+              </w:rPr>
+              <w:t>datetime2</w:t>
+            </w:r>
+          </w:p>
+        </w:tc>
+        <w:tc>
+          <w:tcPr>
+            <w:tcW w:type="dxa" w:w="2160"/>
+          </w:tcPr>
+          <w:p>
+            <w:r/>
+            <w:r>
+              <w:rPr>
+                <w:rFonts w:ascii="Calibri" w:hAnsi="Calibri" w:eastAsia="Calibri"/>
+                <w:b w:val="0"/>
+                <w:color w:val="222222"/>
+                <w:sz w:val="16"/>
+              </w:rPr>
+              <w:t>NULL</w:t>
+            </w:r>
+          </w:p>
+        </w:tc>
+        <w:tc>
+          <w:tcPr>
+            <w:tcW w:type="dxa" w:w="2160"/>
+          </w:tcPr>
+          <w:p>
+            <w:r/>
+            <w:r>
+              <w:rPr>
+                <w:rFonts w:ascii="Calibri" w:hAnsi="Calibri" w:eastAsia="Calibri"/>
+                <w:b w:val="0"/>
+                <w:color w:val="222222"/>
+                <w:sz w:val="16"/>
+              </w:rPr>
+              <w:t>Intent expiry + capture time</w:t>
+            </w:r>
+          </w:p>
+        </w:tc>
+      </w:tr>
+      <w:tr>
+        <w:tc>
+          <w:tcPr>
+            <w:tcW w:type="dxa" w:w="2160"/>
+          </w:tcPr>
+          <w:p>
+            <w:r/>
+            <w:r>
+              <w:rPr>
+                <w:rFonts w:ascii="Calibri" w:hAnsi="Calibri" w:eastAsia="Calibri"/>
+                <w:b w:val="0"/>
+                <w:color w:val="222222"/>
+                <w:sz w:val="16"/>
+              </w:rPr>
+              <w:t>PaymentRecordId</w:t>
+            </w:r>
+          </w:p>
+        </w:tc>
+        <w:tc>
+          <w:tcPr>
+            <w:tcW w:type="dxa" w:w="2160"/>
+          </w:tcPr>
+          <w:p>
+            <w:r/>
+            <w:r>
+              <w:rPr>
+                <w:rFonts w:ascii="Calibri" w:hAnsi="Calibri" w:eastAsia="Calibri"/>
+                <w:b w:val="0"/>
+                <w:color w:val="222222"/>
+                <w:sz w:val="16"/>
+              </w:rPr>
+              <w:t>int</w:t>
+            </w:r>
+          </w:p>
+        </w:tc>
+        <w:tc>
+          <w:tcPr>
+            <w:tcW w:type="dxa" w:w="2160"/>
+          </w:tcPr>
+          <w:p>
+            <w:r/>
+            <w:r>
+              <w:rPr>
+                <w:rFonts w:ascii="Calibri" w:hAnsi="Calibri" w:eastAsia="Calibri"/>
+                <w:b w:val="0"/>
+                <w:color w:val="222222"/>
+                <w:sz w:val="16"/>
+              </w:rPr>
+              <w:t>FK → PaymentRecord, SET NULL, NULL</w:t>
+            </w:r>
+          </w:p>
+        </w:tc>
+        <w:tc>
+          <w:tcPr>
+            <w:tcW w:type="dxa" w:w="2160"/>
+          </w:tcPr>
+          <w:p>
+            <w:r/>
+            <w:r>
+              <w:rPr>
+                <w:rFonts w:ascii="Calibri" w:hAnsi="Calibri" w:eastAsia="Calibri"/>
+                <w:b w:val="0"/>
+                <w:color w:val="222222"/>
+                <w:sz w:val="16"/>
+              </w:rPr>
+              <w:t>Ledger row this intent posted</w:t>
+            </w:r>
+          </w:p>
+        </w:tc>
+      </w:tr>
+      <w:tr>
+        <w:tc>
+          <w:tcPr>
+            <w:tcW w:type="dxa" w:w="2160"/>
+          </w:tcPr>
+          <w:p>
+            <w:r/>
+            <w:r>
+              <w:rPr>
+                <w:rFonts w:ascii="Calibri" w:hAnsi="Calibri" w:eastAsia="Calibri"/>
+                <w:b w:val="0"/>
+                <w:color w:val="222222"/>
+                <w:sz w:val="16"/>
+              </w:rPr>
+              <w:t>CreatedBy</w:t>
+            </w:r>
+          </w:p>
+        </w:tc>
+        <w:tc>
+          <w:tcPr>
+            <w:tcW w:type="dxa" w:w="2160"/>
+          </w:tcPr>
+          <w:p>
+            <w:r/>
+            <w:r>
+              <w:rPr>
+                <w:rFonts w:ascii="Calibri" w:hAnsi="Calibri" w:eastAsia="Calibri"/>
+                <w:b w:val="0"/>
+                <w:color w:val="222222"/>
+                <w:sz w:val="16"/>
+              </w:rPr>
+              <w:t>nvarchar(120)</w:t>
+            </w:r>
+          </w:p>
+        </w:tc>
+        <w:tc>
+          <w:tcPr>
+            <w:tcW w:type="dxa" w:w="2160"/>
+          </w:tcPr>
+          <w:p>
+            <w:r/>
+            <w:r>
+              <w:rPr>
+                <w:rFonts w:ascii="Calibri" w:hAnsi="Calibri" w:eastAsia="Calibri"/>
+                <w:b w:val="0"/>
+                <w:color w:val="222222"/>
+                <w:sz w:val="16"/>
+              </w:rPr>
+            </w:r>
+          </w:p>
+        </w:tc>
+        <w:tc>
+          <w:tcPr>
+            <w:tcW w:type="dxa" w:w="2160"/>
+          </w:tcPr>
+          <w:p>
+            <w:r/>
+            <w:r>
+              <w:rPr>
+                <w:rFonts w:ascii="Calibri" w:hAnsi="Calibri" w:eastAsia="Calibri"/>
+                <w:b w:val="0"/>
+                <w:color w:val="222222"/>
+                <w:sz w:val="16"/>
+              </w:rPr>
+              <w:t>Staff name, or 'guest' for online deposits</w:t>
+            </w:r>
+          </w:p>
+        </w:tc>
+      </w:tr>
+      <w:tr>
+        <w:tc>
+          <w:tcPr>
+            <w:tcW w:type="dxa" w:w="2160"/>
+          </w:tcPr>
+          <w:p>
+            <w:r/>
+            <w:r>
+              <w:rPr>
+                <w:rFonts w:ascii="Calibri" w:hAnsi="Calibri" w:eastAsia="Calibri"/>
+                <w:b w:val="0"/>
+                <w:color w:val="222222"/>
+                <w:sz w:val="16"/>
+              </w:rPr>
+              <w:t>FailureCode</w:t>
+            </w:r>
+          </w:p>
+        </w:tc>
+        <w:tc>
+          <w:tcPr>
+            <w:tcW w:type="dxa" w:w="2160"/>
+          </w:tcPr>
+          <w:p>
+            <w:r/>
+            <w:r>
+              <w:rPr>
+                <w:rFonts w:ascii="Calibri" w:hAnsi="Calibri" w:eastAsia="Calibri"/>
+                <w:b w:val="0"/>
+                <w:color w:val="222222"/>
+                <w:sz w:val="16"/>
+              </w:rPr>
+              <w:t>nvarchar(80)</w:t>
+            </w:r>
+          </w:p>
+        </w:tc>
+        <w:tc>
+          <w:tcPr>
+            <w:tcW w:type="dxa" w:w="2160"/>
+          </w:tcPr>
+          <w:p>
+            <w:r/>
+            <w:r>
+              <w:rPr>
+                <w:rFonts w:ascii="Calibri" w:hAnsi="Calibri" w:eastAsia="Calibri"/>
+                <w:b w:val="0"/>
+                <w:color w:val="222222"/>
+                <w:sz w:val="16"/>
+              </w:rPr>
+              <w:t>NULL</w:t>
+            </w:r>
+          </w:p>
+        </w:tc>
+        <w:tc>
+          <w:tcPr>
+            <w:tcW w:type="dxa" w:w="2160"/>
+          </w:tcPr>
+          <w:p>
+            <w:r/>
+            <w:r>
+              <w:rPr>
+                <w:rFonts w:ascii="Calibri" w:hAnsi="Calibri" w:eastAsia="Calibri"/>
+                <w:b w:val="0"/>
+                <w:color w:val="222222"/>
+                <w:sz w:val="16"/>
+              </w:rPr>
+              <w:t>Xendit failure code</w:t>
+            </w:r>
+          </w:p>
+        </w:tc>
+      </w:tr>
+      <w:tr>
+        <w:tc>
+          <w:tcPr>
+            <w:tcW w:type="dxa" w:w="2160"/>
+          </w:tcPr>
+          <w:p>
+            <w:r/>
+            <w:r>
+              <w:rPr>
+                <w:rFonts w:ascii="Calibri" w:hAnsi="Calibri" w:eastAsia="Calibri"/>
+                <w:b w:val="0"/>
+                <w:color w:val="222222"/>
+                <w:sz w:val="16"/>
+              </w:rPr>
+              <w:t>IsTestMode</w:t>
+            </w:r>
+          </w:p>
+        </w:tc>
+        <w:tc>
+          <w:tcPr>
+            <w:tcW w:type="dxa" w:w="2160"/>
+          </w:tcPr>
+          <w:p>
+            <w:r/>
+            <w:r>
+              <w:rPr>
+                <w:rFonts w:ascii="Calibri" w:hAnsi="Calibri" w:eastAsia="Calibri"/>
+                <w:b w:val="0"/>
+                <w:color w:val="222222"/>
+                <w:sz w:val="16"/>
+              </w:rPr>
+              <w:t>bit</w:t>
+            </w:r>
+          </w:p>
+        </w:tc>
+        <w:tc>
+          <w:tcPr>
+            <w:tcW w:type="dxa" w:w="2160"/>
+          </w:tcPr>
+          <w:p>
+            <w:r/>
+            <w:r>
+              <w:rPr>
+                <w:rFonts w:ascii="Calibri" w:hAnsi="Calibri" w:eastAsia="Calibri"/>
+                <w:b w:val="0"/>
+                <w:color w:val="222222"/>
+                <w:sz w:val="16"/>
+              </w:rPr>
+            </w:r>
+          </w:p>
+        </w:tc>
+        <w:tc>
+          <w:tcPr>
+            <w:tcW w:type="dxa" w:w="2160"/>
+          </w:tcPr>
+          <w:p>
+            <w:r/>
+            <w:r>
+              <w:rPr>
+                <w:rFonts w:ascii="Calibri" w:hAnsi="Calibri" w:eastAsia="Calibri"/>
+                <w:b w:val="0"/>
+                <w:color w:val="222222"/>
+                <w:sz w:val="16"/>
+              </w:rPr>
+              <w:t>Created with the xnd_development key</w:t>
+            </w:r>
+          </w:p>
+        </w:tc>
+      </w:tr>
+      <w:tr>
+        <w:tc>
+          <w:tcPr>
+            <w:tcW w:type="dxa" w:w="2160"/>
+          </w:tcPr>
+          <w:p>
+            <w:r/>
+            <w:r>
+              <w:rPr>
+                <w:rFonts w:ascii="Calibri" w:hAnsi="Calibri" w:eastAsia="Calibri"/>
+                <w:b w:val="0"/>
+                <w:color w:val="222222"/>
+                <w:sz w:val="16"/>
+              </w:rPr>
+              <w:t>CreatedAtUtc / UpdatedAtUtc</w:t>
+            </w:r>
+          </w:p>
+        </w:tc>
+        <w:tc>
+          <w:tcPr>
+            <w:tcW w:type="dxa" w:w="2160"/>
+          </w:tcPr>
+          <w:p>
+            <w:r/>
+            <w:r>
+              <w:rPr>
+                <w:rFonts w:ascii="Calibri" w:hAnsi="Calibri" w:eastAsia="Calibri"/>
+                <w:b w:val="0"/>
+                <w:color w:val="222222"/>
+                <w:sz w:val="16"/>
+              </w:rPr>
+              <w:t>datetime2</w:t>
+            </w:r>
+          </w:p>
+        </w:tc>
+        <w:tc>
+          <w:tcPr>
+            <w:tcW w:type="dxa" w:w="2160"/>
+          </w:tcPr>
+          <w:p>
+            <w:r/>
+            <w:r>
+              <w:rPr>
+                <w:rFonts w:ascii="Calibri" w:hAnsi="Calibri" w:eastAsia="Calibri"/>
+                <w:b w:val="0"/>
+                <w:color w:val="222222"/>
+                <w:sz w:val="16"/>
+              </w:rPr>
+            </w:r>
+          </w:p>
+        </w:tc>
+        <w:tc>
+          <w:tcPr>
+            <w:tcW w:type="dxa" w:w="2160"/>
+          </w:tcPr>
+          <w:p>
+            <w:r/>
+            <w:r>
+              <w:rPr>
+                <w:rFonts w:ascii="Calibri" w:hAnsi="Calibri" w:eastAsia="Calibri"/>
+                <w:b w:val="0"/>
+                <w:color w:val="222222"/>
+                <w:sz w:val="16"/>
+              </w:rPr>
+              <w:t>Audit timestamps</w:t>
             </w:r>
           </w:p>
         </w:tc>
@@ -14067,6 +15838,214 @@
                 <w:color w:val="222222"/>
                 <w:sz w:val="16"/>
               </w:rPr>
+              <w:t>QrPaymentIntent</w:t>
+            </w:r>
+          </w:p>
+        </w:tc>
+        <w:tc>
+          <w:tcPr>
+            <w:tcW w:type="dxa" w:w="1440"/>
+          </w:tcPr>
+          <w:p>
+            <w:r/>
+            <w:r>
+              <w:rPr>
+                <w:rFonts w:ascii="Calibri" w:hAnsi="Calibri" w:eastAsia="Calibri"/>
+                <w:b w:val="0"/>
+                <w:color w:val="222222"/>
+                <w:sz w:val="16"/>
+              </w:rPr>
+              <w:t>BookingId</w:t>
+            </w:r>
+          </w:p>
+        </w:tc>
+        <w:tc>
+          <w:tcPr>
+            <w:tcW w:type="dxa" w:w="1440"/>
+          </w:tcPr>
+          <w:p>
+            <w:r/>
+            <w:r>
+              <w:rPr>
+                <w:rFonts w:ascii="Calibri" w:hAnsi="Calibri" w:eastAsia="Calibri"/>
+                <w:b w:val="0"/>
+                <w:color w:val="222222"/>
+                <w:sz w:val="16"/>
+              </w:rPr>
+              <w:t>Booking</w:t>
+            </w:r>
+          </w:p>
+        </w:tc>
+        <w:tc>
+          <w:tcPr>
+            <w:tcW w:type="dxa" w:w="1440"/>
+          </w:tcPr>
+          <w:p>
+            <w:r/>
+            <w:r>
+              <w:rPr>
+                <w:rFonts w:ascii="Calibri" w:hAnsi="Calibri" w:eastAsia="Calibri"/>
+                <w:b w:val="0"/>
+                <w:color w:val="222222"/>
+                <w:sz w:val="16"/>
+              </w:rPr>
+              <w:t>N : 1</w:t>
+            </w:r>
+          </w:p>
+        </w:tc>
+        <w:tc>
+          <w:tcPr>
+            <w:tcW w:type="dxa" w:w="1440"/>
+          </w:tcPr>
+          <w:p>
+            <w:r/>
+            <w:r>
+              <w:rPr>
+                <w:rFonts w:ascii="Calibri" w:hAnsi="Calibri" w:eastAsia="Calibri"/>
+                <w:b w:val="0"/>
+                <w:color w:val="222222"/>
+                <w:sz w:val="16"/>
+              </w:rPr>
+              <w:t>NO ACTION</w:t>
+            </w:r>
+          </w:p>
+        </w:tc>
+        <w:tc>
+          <w:tcPr>
+            <w:tcW w:type="dxa" w:w="1440"/>
+          </w:tcPr>
+          <w:p>
+            <w:r/>
+            <w:r>
+              <w:rPr>
+                <w:rFonts w:ascii="Calibri" w:hAnsi="Calibri" w:eastAsia="Calibri"/>
+                <w:b w:val="0"/>
+                <w:color w:val="222222"/>
+                <w:sz w:val="16"/>
+              </w:rPr>
+              <w:t>Each payment intent belongs to one stay; deleting the stay is blocked while intents exist.</w:t>
+            </w:r>
+          </w:p>
+        </w:tc>
+      </w:tr>
+      <w:tr>
+        <w:tc>
+          <w:tcPr>
+            <w:tcW w:type="dxa" w:w="1440"/>
+          </w:tcPr>
+          <w:p>
+            <w:r/>
+            <w:r>
+              <w:rPr>
+                <w:rFonts w:ascii="Calibri" w:hAnsi="Calibri" w:eastAsia="Calibri"/>
+                <w:b w:val="0"/>
+                <w:color w:val="222222"/>
+                <w:sz w:val="16"/>
+              </w:rPr>
+              <w:t>QrPaymentIntent</w:t>
+            </w:r>
+          </w:p>
+        </w:tc>
+        <w:tc>
+          <w:tcPr>
+            <w:tcW w:type="dxa" w:w="1440"/>
+          </w:tcPr>
+          <w:p>
+            <w:r/>
+            <w:r>
+              <w:rPr>
+                <w:rFonts w:ascii="Calibri" w:hAnsi="Calibri" w:eastAsia="Calibri"/>
+                <w:b w:val="0"/>
+                <w:color w:val="222222"/>
+                <w:sz w:val="16"/>
+              </w:rPr>
+              <w:t>PaymentRecordId</w:t>
+            </w:r>
+          </w:p>
+        </w:tc>
+        <w:tc>
+          <w:tcPr>
+            <w:tcW w:type="dxa" w:w="1440"/>
+          </w:tcPr>
+          <w:p>
+            <w:r/>
+            <w:r>
+              <w:rPr>
+                <w:rFonts w:ascii="Calibri" w:hAnsi="Calibri" w:eastAsia="Calibri"/>
+                <w:b w:val="0"/>
+                <w:color w:val="222222"/>
+                <w:sz w:val="16"/>
+              </w:rPr>
+              <w:t>PaymentRecord</w:t>
+            </w:r>
+          </w:p>
+        </w:tc>
+        <w:tc>
+          <w:tcPr>
+            <w:tcW w:type="dxa" w:w="1440"/>
+          </w:tcPr>
+          <w:p>
+            <w:r/>
+            <w:r>
+              <w:rPr>
+                <w:rFonts w:ascii="Calibri" w:hAnsi="Calibri" w:eastAsia="Calibri"/>
+                <w:b w:val="0"/>
+                <w:color w:val="222222"/>
+                <w:sz w:val="16"/>
+              </w:rPr>
+              <w:t>N : 0..1</w:t>
+            </w:r>
+          </w:p>
+        </w:tc>
+        <w:tc>
+          <w:tcPr>
+            <w:tcW w:type="dxa" w:w="1440"/>
+          </w:tcPr>
+          <w:p>
+            <w:r/>
+            <w:r>
+              <w:rPr>
+                <w:rFonts w:ascii="Calibri" w:hAnsi="Calibri" w:eastAsia="Calibri"/>
+                <w:b w:val="0"/>
+                <w:color w:val="222222"/>
+                <w:sz w:val="16"/>
+              </w:rPr>
+              <w:t>SET NULL</w:t>
+            </w:r>
+          </w:p>
+        </w:tc>
+        <w:tc>
+          <w:tcPr>
+            <w:tcW w:type="dxa" w:w="1440"/>
+          </w:tcPr>
+          <w:p>
+            <w:r/>
+            <w:r>
+              <w:rPr>
+                <w:rFonts w:ascii="Calibri" w:hAnsi="Calibri" w:eastAsia="Calibri"/>
+                <w:b w:val="0"/>
+                <w:color w:val="222222"/>
+                <w:sz w:val="16"/>
+              </w:rPr>
+              <w:t>A paid intent links to the ledger row it posted; voiding/removing the payment keeps the intent.</w:t>
+            </w:r>
+          </w:p>
+        </w:tc>
+      </w:tr>
+      <w:tr>
+        <w:tc>
+          <w:tcPr>
+            <w:tcW w:type="dxa" w:w="1440"/>
+          </w:tcPr>
+          <w:p>
+            <w:r/>
+            <w:r>
+              <w:rPr>
+                <w:rFonts w:ascii="Calibri" w:hAnsi="Calibri" w:eastAsia="Calibri"/>
+                <w:b w:val="0"/>
+                <w:color w:val="222222"/>
+                <w:sz w:val="16"/>
+              </w:rPr>
               <w:t>PaymentRecord</w:t>
             </w:r>
           </w:p>
@@ -14458,7 +16437,7 @@
                 <w:color w:val="222222"/>
                 <w:sz w:val="16"/>
               </w:rPr>
-              <w:t>BookingItem, BookingCharge, StayReview, AccountExternalLogin, AccountAuthToken, PasswordResetCode</w:t>
+              <w:t>BookingItem, BookingCharge, StayReview, QrPaymentIntent, AccountExternalLogin, AccountAuthToken, PasswordResetCode</w:t>
             </w:r>
           </w:p>
         </w:tc>
@@ -15924,6 +17903,247 @@
                 <w:sz w:val="16"/>
               </w:rPr>
               <w:t>RoomType can't be deleted while Rooms reference it</w:t>
+            </w:r>
+          </w:p>
+        </w:tc>
+      </w:tr>
+    </w:tbl>
+    <w:p>
+      <w:pPr>
+        <w:pStyle w:val="Heading2"/>
+      </w:pPr>
+      <w:r>
+        <w:rPr>
+          <w:rFonts w:ascii="Calibri" w:hAnsi="Calibri" w:eastAsia="Calibri"/>
+          <w:b/>
+          <w:color w:val="0B1F3A"/>
+          <w:sz w:val="30"/>
+        </w:rPr>
+        <w:t>5. Schema changes since the previous revision</w:t>
+      </w:r>
+    </w:p>
+    <w:tbl>
+      <w:tblPr>
+        <w:tblStyle w:val="TableGrid"/>
+        <w:tblW w:type="auto" w:w="0"/>
+        <w:tblLook w:firstColumn="1" w:firstRow="1" w:lastColumn="0" w:lastRow="0" w:noHBand="0" w:noVBand="1" w:val="04A0"/>
+      </w:tblPr>
+      <w:tblGrid>
+        <w:gridCol w:w="2880"/>
+        <w:gridCol w:w="2880"/>
+        <w:gridCol w:w="2880"/>
+      </w:tblGrid>
+      <w:tr>
+        <w:tc>
+          <w:tcPr>
+            <w:tcW w:type="dxa" w:w="2880"/>
+            <w:shd w:fill="D9EDED" w:val="clear"/>
+          </w:tcPr>
+          <w:p>
+            <w:r/>
+            <w:r>
+              <w:rPr>
+                <w:rFonts w:ascii="Calibri" w:hAnsi="Calibri" w:eastAsia="Calibri"/>
+                <w:b/>
+                <w:color w:val="0B1F3A"/>
+                <w:sz w:val="16"/>
+              </w:rPr>
+              <w:t>Migration</w:t>
+            </w:r>
+          </w:p>
+        </w:tc>
+        <w:tc>
+          <w:tcPr>
+            <w:tcW w:type="dxa" w:w="2880"/>
+            <w:shd w:fill="D9EDED" w:val="clear"/>
+          </w:tcPr>
+          <w:p>
+            <w:r/>
+            <w:r>
+              <w:rPr>
+                <w:rFonts w:ascii="Calibri" w:hAnsi="Calibri" w:eastAsia="Calibri"/>
+                <w:b/>
+                <w:color w:val="0B1F3A"/>
+                <w:sz w:val="16"/>
+              </w:rPr>
+              <w:t>Scope</w:t>
+            </w:r>
+          </w:p>
+        </w:tc>
+        <w:tc>
+          <w:tcPr>
+            <w:tcW w:type="dxa" w:w="2880"/>
+            <w:shd w:fill="D9EDED" w:val="clear"/>
+          </w:tcPr>
+          <w:p>
+            <w:r/>
+            <w:r>
+              <w:rPr>
+                <w:rFonts w:ascii="Calibri" w:hAnsi="Calibri" w:eastAsia="Calibri"/>
+                <w:b/>
+                <w:color w:val="0B1F3A"/>
+                <w:sz w:val="16"/>
+              </w:rPr>
+              <w:t>What changed</w:t>
+            </w:r>
+          </w:p>
+        </w:tc>
+      </w:tr>
+      <w:tr>
+        <w:tc>
+          <w:tcPr>
+            <w:tcW w:type="dxa" w:w="2880"/>
+          </w:tcPr>
+          <w:p>
+            <w:r/>
+            <w:r>
+              <w:rPr>
+                <w:rFonts w:ascii="Calibri" w:hAnsi="Calibri" w:eastAsia="Calibri"/>
+                <w:b w:val="0"/>
+                <w:color w:val="222222"/>
+                <w:sz w:val="16"/>
+              </w:rPr>
+              <w:t>20260926034455_AddGuestEditTracking</w:t>
+            </w:r>
+          </w:p>
+        </w:tc>
+        <w:tc>
+          <w:tcPr>
+            <w:tcW w:type="dxa" w:w="2880"/>
+          </w:tcPr>
+          <w:p>
+            <w:r/>
+            <w:r>
+              <w:rPr>
+                <w:rFonts w:ascii="Calibri" w:hAnsi="Calibri" w:eastAsia="Calibri"/>
+                <w:b w:val="0"/>
+                <w:color w:val="222222"/>
+                <w:sz w:val="16"/>
+              </w:rPr>
+              <w:t>Booking</w:t>
+            </w:r>
+          </w:p>
+        </w:tc>
+        <w:tc>
+          <w:tcPr>
+            <w:tcW w:type="dxa" w:w="2880"/>
+          </w:tcPr>
+          <w:p>
+            <w:r/>
+            <w:r>
+              <w:rPr>
+                <w:rFonts w:ascii="Calibri" w:hAnsi="Calibri" w:eastAsia="Calibri"/>
+                <w:b w:val="0"/>
+                <w:color w:val="222222"/>
+                <w:sz w:val="16"/>
+              </w:rPr>
+              <w:t>Added GuestEditedFieldsJson, LastGuestEditAtUtc, GuestEditsSeenByStaff — tracks guest self-edits after booking and whether staff has seen them.</w:t>
+            </w:r>
+          </w:p>
+        </w:tc>
+      </w:tr>
+      <w:tr>
+        <w:tc>
+          <w:tcPr>
+            <w:tcW w:type="dxa" w:w="2880"/>
+          </w:tcPr>
+          <w:p>
+            <w:r/>
+            <w:r>
+              <w:rPr>
+                <w:rFonts w:ascii="Calibri" w:hAnsi="Calibri" w:eastAsia="Calibri"/>
+                <w:b w:val="0"/>
+                <w:color w:val="222222"/>
+                <w:sz w:val="16"/>
+              </w:rPr>
+              <w:t>20260927091818_AddQrPaymentIntent</w:t>
+            </w:r>
+          </w:p>
+        </w:tc>
+        <w:tc>
+          <w:tcPr>
+            <w:tcW w:type="dxa" w:w="2880"/>
+          </w:tcPr>
+          <w:p>
+            <w:r/>
+            <w:r>
+              <w:rPr>
+                <w:rFonts w:ascii="Calibri" w:hAnsi="Calibri" w:eastAsia="Calibri"/>
+                <w:b w:val="0"/>
+                <w:color w:val="222222"/>
+                <w:sz w:val="16"/>
+              </w:rPr>
+              <w:t>QrPaymentIntent (new table)</w:t>
+            </w:r>
+          </w:p>
+        </w:tc>
+        <w:tc>
+          <w:tcPr>
+            <w:tcW w:type="dxa" w:w="2880"/>
+          </w:tcPr>
+          <w:p>
+            <w:r/>
+            <w:r>
+              <w:rPr>
+                <w:rFonts w:ascii="Calibri" w:hAnsi="Calibri" w:eastAsia="Calibri"/>
+                <w:b w:val="0"/>
+                <w:color w:val="222222"/>
+                <w:sz w:val="16"/>
+              </w:rPr>
+              <w:t>Xendit QRPh walk-in payment intents: unique ReferenceId, post-once XenditPaymentId, FK to Booking (RESTRICT) and to PaymentRecord (SET NULL).</w:t>
+            </w:r>
+          </w:p>
+        </w:tc>
+      </w:tr>
+      <w:tr>
+        <w:tc>
+          <w:tcPr>
+            <w:tcW w:type="dxa" w:w="2880"/>
+          </w:tcPr>
+          <w:p>
+            <w:r/>
+            <w:r>
+              <w:rPr>
+                <w:rFonts w:ascii="Calibri" w:hAnsi="Calibri" w:eastAsia="Calibri"/>
+                <w:b w:val="0"/>
+                <w:color w:val="222222"/>
+                <w:sz w:val="16"/>
+              </w:rPr>
+              <w:t>20260930094927_AddGuestDepositCheckout</w:t>
+            </w:r>
+          </w:p>
+        </w:tc>
+        <w:tc>
+          <w:tcPr>
+            <w:tcW w:type="dxa" w:w="2880"/>
+          </w:tcPr>
+          <w:p>
+            <w:r/>
+            <w:r>
+              <w:rPr>
+                <w:rFonts w:ascii="Calibri" w:hAnsi="Calibri" w:eastAsia="Calibri"/>
+                <w:b w:val="0"/>
+                <w:color w:val="222222"/>
+                <w:sz w:val="16"/>
+              </w:rPr>
+              <w:t>Booking + QrPaymentIntent</w:t>
+            </w:r>
+          </w:p>
+        </w:tc>
+        <w:tc>
+          <w:tcPr>
+            <w:tcW w:type="dxa" w:w="2880"/>
+          </w:tcPr>
+          <w:p>
+            <w:r/>
+            <w:r>
+              <w:rPr>
+                <w:rFonts w:ascii="Calibri" w:hAnsi="Calibri" w:eastAsia="Calibri"/>
+                <w:b w:val="0"/>
+                <w:color w:val="222222"/>
+                <w:sz w:val="16"/>
+              </w:rPr>
+              <w:t>Online 50% deposit checkout: Booking gains GuestPayToken (unique, filtered) and DepositDueAtUtc (30-minute hold). QrPaymentIntent gains Channel (QrPh|Card), EventType (Deposit|ArrivalPayment, stored as int with a -1 sentinel), XenditInvoiceId (unique, filtered) and CheckoutUrl; XenditPaymentRequestId and QrString become nullable for hosted card checkouts.</w:t>
             </w:r>
           </w:p>
         </w:tc>

</xml_diff>